<commit_message>
Updated CV with PhD TA Training class
</commit_message>
<xml_diff>
--- a/KanchanadeviVenkataraman_CV.docx
+++ b/KanchanadeviVenkataraman_CV.docx
@@ -31,7 +31,7 @@
         <w:spacing w:after="0" w:before="0"/>
       </w:pPr>
       <w:r>
-        <w:t>Department of Computer Science, Engineering Building II (Koch Hall), 890 Oval Drive, Campus Box 8206, Raleigh, NC 27695</w:t>
+        <w:t>Department of Computer Science, Koch Hall (Engineering Building II), 890 Oval Drive, Campus Box 8206, Raleigh, NC 27695</w:t>
       </w:r>
     </w:p>
     <w:p>
@@ -1521,6 +1521,16 @@
       </w:pPr>
       <w:r>
         <w:t>Electives (2026): Teaching in an AI Environment (Feb 27); Processing Course Evaluations (Mar 27); Writing a Teaching Philosophy (Apr 3); Microlearning &gt; Teaching Moodle course (Jul)</w:t>
+      </w:r>
+    </w:p>
+    <w:p>
+      <w:pPr>
+        <w:pStyle w:val="ListBullet"/>
+        <w:spacing w:after="0"/>
+        <w:ind w:left="360" w:hanging="259"/>
+      </w:pPr>
+      <w:r>
+        <w:t>In progress — CSC 791: PhD Teaching Assistant Training (2 credits), Department of Computer Science, NC State University, Fall 2026 (presentation skills, supporting student needs, educational psychology)</w:t>
       </w:r>
     </w:p>
     <w:p>

</xml_diff>